<commit_message>
fix(docs): the latex article does not work, adjust the other documents
</commit_message>
<xml_diff>
--- a/08-week/01-session/02-activity/UrbanTracker_Investigation_Article.docx
+++ b/08-week/01-session/02-activity/UrbanTracker_Investigation_Article.docx
@@ -763,13 +763,7 @@
         <w:t>autentificación</w:t>
       </w:r>
       <w:r>
-        <w:t xml:space="preserve"> de conductores para iniciar rutas, y un módulo de administración de rutas, conductores y vehículos. A </w:t>
-      </w:r>
-      <w:r>
-        <w:t>continuación,</w:t>
-      </w:r>
-      <w:r>
-        <w:t xml:space="preserve"> se detallan el fundamento teórico, el enfoque de desarrollo, los resultados obtenidos y las conclusiones del proyecto </w:t>
+        <w:t xml:space="preserve"> de conductores para iniciar rutas, y un módulo de administración de rutas, conductores y vehículos. A continuación, se detallan el fundamento teórico, el enfoque de desarrollo, los resultados obtenidos y las conclusiones del proyecto </w:t>
       </w:r>
       <w:proofErr w:type="spellStart"/>
       <w:r>
@@ -1787,10 +1781,17 @@
       </w:r>
     </w:p>
     <w:p>
+      <w:pPr>
+        <w:ind w:left="720" w:firstLine="0"/>
+      </w:pPr>
+    </w:p>
+    <w:p>
       <w:r>
         <w:t>En conjunto, el sistema demuestra un rendimiento adecuado a pequeña escala. Aunque faltan implementar pruebas unitarias completas y funcionalidades avanzadas (por ejemplo, alertas o análisis predictivo), los componentes construidos funcionan de manera integrada. En particular, la eficacia del canal MQTT fue notable: la literatura confirma que, comparado con peticiones periódicas, el enfoque pub-sub evita sobrecarga y reduce el consumo de red, tal como se observó en este proyecto.</w:t>
       </w:r>
     </w:p>
+    <w:p/>
+    <w:p/>
     <w:p/>
     <w:bookmarkEnd w:id="0"/>
     <w:p>
@@ -1802,6 +1803,7 @@
         <w:rPr>
           <w:b/>
         </w:rPr>
+        <w:lastRenderedPageBreak/>
         <w:t>Conclusiones</w:t>
       </w:r>
     </w:p>
@@ -1831,11 +1833,7 @@
       </w:r>
       <w:proofErr w:type="spellEnd"/>
       <w:r>
-        <w:t xml:space="preserve"> en el servidor, </w:t>
-      </w:r>
-      <w:r>
-        <w:lastRenderedPageBreak/>
-        <w:t>comunicados por MQTT, permitió lograr actualizaciones geográficas con latencias bajas (cercanas a los cientos de ms) y comunicación fluida entre componentes. Según Villagra et al. (2021), arquitecturas orientadas a eventos con MQTT mantienen bajos costos de recurso y alta escalabilidad, lo que se valida en la práctica para el alcance de este proyecto.</w:t>
+        <w:t xml:space="preserve"> en el servidor, comunicados por MQTT, permitió lograr actualizaciones geográficas con latencias bajas (cercanas a los cientos de ms) y comunicación fluida entre componentes. Según Villagra et al. (2021), arquitecturas orientadas a eventos con MQTT mantienen bajos costos de recurso y alta escalabilidad, lo que se valida en la práctica para el alcance de este proyecto.</w:t>
       </w:r>
     </w:p>
     <w:p>
@@ -1890,7 +1888,11 @@
         <w:spacing w:after="200"/>
       </w:pPr>
       <w:r>
-        <w:t xml:space="preserve">Como pasos futuros se recomienda completar el desarrollo de pruebas unitarias e interfaces, así como explorar la incorporación de análisis predictivo (por ejemplo, estimaciones de llegada al estilo de </w:t>
+        <w:t xml:space="preserve">Como pasos futuros se recomienda completar el desarrollo de pruebas unitarias e interfaces, así como explorar la incorporación de análisis predictivo (por ejemplo, estimaciones </w:t>
+      </w:r>
+      <w:r>
+        <w:lastRenderedPageBreak/>
+        <w:t xml:space="preserve">de llegada al estilo de </w:t>
       </w:r>
       <w:proofErr w:type="spellStart"/>
       <w:r>
@@ -1906,11 +1908,7 @@
       </w:r>
       <w:proofErr w:type="spellEnd"/>
       <w:r>
-        <w:t xml:space="preserve"> cumple los objetivos iniciales: optimizar la experiencia </w:t>
-      </w:r>
-      <w:r>
-        <w:lastRenderedPageBreak/>
-        <w:t>del usuario y la operación del servicio público de transporte mediante tecnología de geolocalización en tiempo real.</w:t>
+        <w:t xml:space="preserve"> cumple los objetivos iniciales: optimizar la experiencia del usuario y la operación del servicio público de transporte mediante tecnología de geolocalización en tiempo real.</w:t>
       </w:r>
     </w:p>
     <w:p>
@@ -2608,52 +2606,6 @@
           <w:color w:val="000000" w:themeColor="text1"/>
         </w:rPr>
         <w:t>, 12(22), 9541.</w:t>
-      </w:r>
-    </w:p>
-    <w:p>
-      <w:pPr>
-        <w:numPr>
-          <w:ilvl w:val="0"/>
-          <w:numId w:val="11"/>
-        </w:numPr>
-        <w:spacing w:after="200" w:line="240" w:lineRule="auto"/>
-        <w:rPr>
-          <w:color w:val="000000" w:themeColor="text1"/>
-        </w:rPr>
-      </w:pPr>
-      <w:r>
-        <w:rPr>
-          <w:color w:val="000000" w:themeColor="text1"/>
-        </w:rPr>
-        <w:t xml:space="preserve">Lazcano Calixto, R. N., Valencia González, L. Á., Baena Díaz, D. E. &amp; Venegas Guzmán, R. (2019). </w:t>
-      </w:r>
-      <w:proofErr w:type="spellStart"/>
-      <w:r>
-        <w:rPr>
-          <w:color w:val="000000" w:themeColor="text1"/>
-        </w:rPr>
-        <w:t>React</w:t>
-      </w:r>
-      <w:proofErr w:type="spellEnd"/>
-      <w:r>
-        <w:rPr>
-          <w:color w:val="000000" w:themeColor="text1"/>
-        </w:rPr>
-        <w:t xml:space="preserve"> Native: Acortando las distancias entre desarrollo y diseño móvil multiplataforma. </w:t>
-      </w:r>
-      <w:r>
-        <w:rPr>
-          <w:i/>
-          <w:iCs/>
-          <w:color w:val="000000" w:themeColor="text1"/>
-        </w:rPr>
-        <w:t>Revista Digital Universitaria</w:t>
-      </w:r>
-      <w:r>
-        <w:rPr>
-          <w:color w:val="000000" w:themeColor="text1"/>
-        </w:rPr>
-        <w:t>, 20(5).</w:t>
       </w:r>
     </w:p>
     <w:p>
@@ -5151,6 +5103,7 @@
   <w:style w:type="character" w:default="1" w:styleId="Fuentedeprrafopredeter">
     <w:name w:val="Default Paragraph Font"/>
     <w:uiPriority w:val="1"/>
+    <w:semiHidden/>
     <w:unhideWhenUsed/>
   </w:style>
   <w:style w:type="table" w:default="1" w:styleId="Tablanormal">

</xml_diff>